<commit_message>
ran KM curves on selected risk factors for exploratory analysis. completed data analysis plan
</commit_message>
<xml_diff>
--- a/Project3/Reports/Project3_Data_Analysis_Plan.docx
+++ b/Project3/Reports/Project3_Data_Analysis_Plan.docx
@@ -337,7 +337,21 @@
                 <w:rStyle w:val="Hyperlink"/>
                 <w:noProof/>
               </w:rPr>
-              <w:t>3. Preliminary Results</w:t>
+              <w:t>3. Pr</w:t>
+            </w:r>
+            <w:r>
+              <w:rPr>
+                <w:rStyle w:val="Hyperlink"/>
+                <w:noProof/>
+              </w:rPr>
+              <w:t>e</w:t>
+            </w:r>
+            <w:r>
+              <w:rPr>
+                <w:rStyle w:val="Hyperlink"/>
+                <w:noProof/>
+              </w:rPr>
+              <w:t>liminary Results</w:t>
             </w:r>
             <w:r>
               <w:rPr>
@@ -508,7 +522,7 @@
     </w:p>
     <w:p>
       <w:r>
-        <w:t>As a secondary aim, this report will describe the degree of change in key risk factors across the three examination periods. This descriptive information will inform whether a more complex time-varying covariate analysis may be warranted in future work. Although a time-varying covariate analysis is beyond the scope of this report, the discussion will address how and why results may differ if time-varying covariates were to be incorporated into the model.</w:t>
+        <w:t xml:space="preserve">As a secondary aim, this report will describe the degree of change in key risk factors across the three examination periods. This descriptive information will inform whether a more complex time-varying covariate analysis may be warranted in future work. </w:t>
       </w:r>
     </w:p>
     <w:p>
@@ -531,9 +545,6 @@
         <w:t>.</w:t>
       </w:r>
     </w:p>
-    <w:p/>
-    <w:p/>
-    <w:p/>
     <w:p/>
     <w:p>
       <w:pPr>
@@ -543,7 +554,6 @@
       <w:bookmarkStart w:id="10" w:name="_Toc221895381"/>
       <w:bookmarkStart w:id="11" w:name="_Toc222223986"/>
       <w:r>
-        <w:lastRenderedPageBreak/>
         <w:t xml:space="preserve">2. </w:t>
       </w:r>
       <w:r>
@@ -599,6 +609,7 @@
     </w:p>
     <w:p>
       <w:r>
+        <w:lastRenderedPageBreak/>
         <w:t>The primary outcome is time to first stroke, measured in days. Participants who did not experience a stroke within the 10-year follow-up window were censored at either 10 years or their last observed follow-up time, whichever came first. A binary indicator variable was also created to denote whether a participant experienced a stroke within 10 years (yes/no), which will be used for computing 10-year stroke probabilities by risk profile.</w:t>
       </w:r>
     </w:p>
@@ -740,7 +751,13 @@
         <w:spacing w:after="0" w:line="240" w:lineRule="auto"/>
       </w:pPr>
       <w:r>
-        <w:t>Potential correlations and confounding among predictors will be assessed. Sensitivity analyses will be conducted to evaluate the impact of high correlation and confounding among predictors (e.g., systolic BP and BP medication use) on model estimates and interpretation, including the impact of including or excluding these predictors.</w:t>
+        <w:t>Potential correlations and confounding among predictors will be assessed</w:t>
+      </w:r>
+      <w:r>
+        <w:t xml:space="preserve"> using s</w:t>
+      </w:r>
+      <w:r>
+        <w:t>ensitivity analyses to evaluate the impact of high correlation and confounding among predictors (e.g., systolic BP and BP medication use) on model estimates and interpretation, including the impact of including or excluding these predictors.</w:t>
       </w:r>
       <w:r>
         <w:br/>
@@ -754,16 +771,24 @@
         <w:t>s</w:t>
       </w:r>
       <w:r>
-        <w:t xml:space="preserve"> for different risk profiles of interest, stratified by sex. Risk profiles will be defined by clinically meaningful combinations of significant risk factors identified in the multivariable model.</w:t>
-      </w:r>
-    </w:p>
-    <w:p>
-      <w:r>
-        <w:t xml:space="preserve">As an additional descriptive aim, the degree of change in key risk factors across the three examination periods will be summarized using means and standard deviations for </w:t>
-      </w:r>
-      <w:r>
-        <w:lastRenderedPageBreak/>
-        <w:t>continuous variables and proportions for categorical variables. This will inform whether a time-varying covariate analysis may be warranted in future work.</w:t>
+        <w:t xml:space="preserve"> for different risk profiles of interest, stratified by sex. Risk profiles will be defined by</w:t>
+      </w:r>
+      <w:r>
+        <w:t xml:space="preserve"> stratifying ages 40, 50, and 60 along with</w:t>
+      </w:r>
+      <w:r>
+        <w:t xml:space="preserve"> clinically meaningful combinations of </w:t>
+      </w:r>
+      <w:r>
+        <w:t xml:space="preserve">significant </w:t>
+      </w:r>
+      <w:r>
+        <w:t>risk factors identified in the multivariable model.</w:t>
+      </w:r>
+    </w:p>
+    <w:p>
+      <w:r>
+        <w:t>As an additional descriptive aim, the degree of change in key risk factors across the three examination periods will be summarized using means and standard deviations for continuous variables and proportions for categorical variables. This will inform whether a time-varying covariate analysis may be warranted in future work.</w:t>
       </w:r>
     </w:p>
     <w:p>
@@ -823,10 +848,13 @@
         <w:jc w:val="center"/>
       </w:pPr>
       <w:r>
+        <w:rPr>
+          <w:noProof/>
+        </w:rPr>
         <w:drawing>
-          <wp:inline distT="0" distB="0" distL="0" distR="0" wp14:anchorId="3EFE83D0" wp14:editId="0CC93FE0">
-            <wp:extent cx="4969565" cy="6623431"/>
-            <wp:effectExtent l="0" t="0" r="0" b="6350"/>
+          <wp:inline distT="0" distB="0" distL="0" distR="0" wp14:anchorId="3EFE83D0" wp14:editId="66233C42">
+            <wp:extent cx="4874116" cy="6496216"/>
+            <wp:effectExtent l="0" t="0" r="3175" b="0"/>
             <wp:docPr id="1470798841" name="Picture 1"/>
             <wp:cNvGraphicFramePr>
               <a:graphicFrameLocks xmlns:a="http://schemas.openxmlformats.org/drawingml/2006/main" noChangeAspect="1"/>
@@ -847,7 +875,7 @@
                   <pic:spPr>
                     <a:xfrm>
                       <a:off x="0" y="0"/>
-                      <a:ext cx="5075799" cy="6765019"/>
+                      <a:ext cx="5047205" cy="6726909"/>
                     </a:xfrm>
                     <a:prstGeom prst="rect">
                       <a:avLst/>
@@ -1057,11 +1085,7 @@
         <w:t xml:space="preserve"> higher </w:t>
       </w:r>
       <w:r>
-        <w:t xml:space="preserve">among men as compared to </w:t>
-      </w:r>
-      <w:r>
-        <w:lastRenderedPageBreak/>
-        <w:t>women</w:t>
+        <w:t>among men as compared to women</w:t>
       </w:r>
       <w:r>
         <w:t>.</w:t>
@@ -1117,6 +1141,7 @@
       </w:pPr>
       <w:r>
         <w:rPr>
+          <w:noProof/>
           <w:color w:val="000000" w:themeColor="text1"/>
         </w:rPr>
         <w:drawing>
@@ -1230,115 +1255,24 @@
         <w:t>minimal difference in stroke-free survival between sexes</w:t>
       </w:r>
       <w:r>
+        <w:t xml:space="preserve"> at baseline risk</w:t>
+      </w:r>
+      <w:r>
         <w:t>.</w:t>
       </w:r>
     </w:p>
     <w:p/>
     <w:p/>
+    <w:p/>
     <w:p>
       <w:pPr>
         <w:jc w:val="center"/>
-        <w:rPr>
-          <w:color w:val="000000" w:themeColor="text1"/>
-        </w:rPr>
-      </w:pPr>
-      <w:r>
-        <w:rPr>
-          <w:color w:val="000000" w:themeColor="text1"/>
+      </w:pPr>
+      <w:r>
+        <w:rPr>
+          <w:noProof/>
         </w:rPr>
         <w:lastRenderedPageBreak/>
-        <w:drawing>
-          <wp:inline distT="0" distB="0" distL="0" distR="0" wp14:anchorId="0AC255A3" wp14:editId="461CF03C">
-            <wp:extent cx="5117722" cy="1685677"/>
-            <wp:effectExtent l="0" t="0" r="635" b="3810"/>
-            <wp:docPr id="1293435965" name="Picture 1"/>
-            <wp:cNvGraphicFramePr>
-              <a:graphicFrameLocks xmlns:a="http://schemas.openxmlformats.org/drawingml/2006/main" noChangeAspect="1"/>
-            </wp:cNvGraphicFramePr>
-            <a:graphic xmlns:a="http://schemas.openxmlformats.org/drawingml/2006/main">
-              <a:graphicData uri="http://schemas.openxmlformats.org/drawingml/2006/picture">
-                <pic:pic xmlns:pic="http://schemas.openxmlformats.org/drawingml/2006/picture">
-                  <pic:nvPicPr>
-                    <pic:cNvPr id="1293435965" name=""/>
-                    <pic:cNvPicPr/>
-                  </pic:nvPicPr>
-                  <pic:blipFill>
-                    <a:blip r:embed="rId8"/>
-                    <a:stretch>
-                      <a:fillRect/>
-                    </a:stretch>
-                  </pic:blipFill>
-                  <pic:spPr>
-                    <a:xfrm>
-                      <a:off x="0" y="0"/>
-                      <a:ext cx="5338575" cy="1758422"/>
-                    </a:xfrm>
-                    <a:prstGeom prst="rect">
-                      <a:avLst/>
-                    </a:prstGeom>
-                  </pic:spPr>
-                </pic:pic>
-              </a:graphicData>
-            </a:graphic>
-          </wp:inline>
-        </w:drawing>
-      </w:r>
-    </w:p>
-    <w:p>
-      <w:pPr>
-        <w:pStyle w:val="Caption"/>
-        <w:rPr>
-          <w:color w:val="000000" w:themeColor="text1"/>
-          <w:sz w:val="21"/>
-          <w:szCs w:val="21"/>
-        </w:rPr>
-      </w:pPr>
-      <w:r>
-        <w:rPr>
-          <w:b/>
-          <w:bCs/>
-          <w:color w:val="000000" w:themeColor="text1"/>
-          <w:sz w:val="21"/>
-          <w:szCs w:val="21"/>
-        </w:rPr>
-        <w:t xml:space="preserve">Table </w:t>
-      </w:r>
-      <w:r>
-        <w:rPr>
-          <w:b/>
-          <w:bCs/>
-          <w:color w:val="000000" w:themeColor="text1"/>
-          <w:sz w:val="21"/>
-          <w:szCs w:val="21"/>
-        </w:rPr>
-        <w:t>2</w:t>
-      </w:r>
-      <w:r>
-        <w:rPr>
-          <w:color w:val="000000" w:themeColor="text1"/>
-          <w:sz w:val="21"/>
-          <w:szCs w:val="21"/>
-        </w:rPr>
-        <w:t>. Distribution of follow-up time (time to stroke or censoring) over 10 years, stratified by sex. Summary statistics include mean, standard deviation, and selected percentiles of observed follow-up time in days.</w:t>
-      </w:r>
-    </w:p>
-    <w:p>
-      <w:r>
-        <w:t xml:space="preserve">Follow-up time was similar between men and women, with mean follow-up of approximately 3,432 days (≈9.4 years) in men and 3,505 days (≈9.6 years) in women. The median follow-up time was 3,652 days (10 years) for both groups, indicating that a large proportion of participants </w:t>
-      </w:r>
-      <w:r>
-        <w:t>did not experience an event in the</w:t>
-      </w:r>
-      <w:r>
-        <w:t xml:space="preserve"> 10-year period. Overall, these results suggest minimal differences in follow-up time by sex.</w:t>
-      </w:r>
-    </w:p>
-    <w:p/>
-    <w:p>
-      <w:pPr>
-        <w:jc w:val="center"/>
-      </w:pPr>
-      <w:r>
         <w:drawing>
           <wp:inline distT="0" distB="0" distL="0" distR="0" wp14:anchorId="79583EA6" wp14:editId="69019908">
             <wp:extent cx="5209242" cy="3601941"/>
@@ -1355,7 +1289,7 @@
                     <pic:cNvPicPr/>
                   </pic:nvPicPr>
                   <pic:blipFill>
-                    <a:blip r:embed="rId9"/>
+                    <a:blip r:embed="rId8"/>
                     <a:stretch>
                       <a:fillRect/>
                     </a:stretch>
@@ -1381,7 +1315,9 @@
         <w:jc w:val="center"/>
       </w:pPr>
       <w:r>
-        <w:lastRenderedPageBreak/>
+        <w:rPr>
+          <w:noProof/>
+        </w:rPr>
         <w:drawing>
           <wp:inline distT="0" distB="0" distL="0" distR="0" wp14:anchorId="238900DD" wp14:editId="2BD98E78">
             <wp:extent cx="5230368" cy="3611526"/>
@@ -1398,7 +1334,7 @@
                     <pic:cNvPicPr/>
                   </pic:nvPicPr>
                   <pic:blipFill>
-                    <a:blip r:embed="rId10"/>
+                    <a:blip r:embed="rId9"/>
                     <a:stretch>
                       <a:fillRect/>
                     </a:stretch>
@@ -1475,6 +1411,7 @@
     </w:p>
     <w:p>
       <w:r>
+        <w:lastRenderedPageBreak/>
         <w:t xml:space="preserve">Kaplan–Meier curves stratified by selected baseline risk factors showed modest differences in stroke-free survival over 10 years. Lower survival probabilities were observed among participants with elevated systolic </w:t>
       </w:r>
       <w:r>
@@ -2622,6 +2559,7 @@
   <w:style w:type="character" w:default="1" w:styleId="DefaultParagraphFont">
     <w:name w:val="Default Paragraph Font"/>
     <w:uiPriority w:val="1"/>
+    <w:semiHidden/>
     <w:unhideWhenUsed/>
   </w:style>
   <w:style w:type="table" w:default="1" w:styleId="TableNormal">

</xml_diff>